<commit_message>
chore(contract): 템플릿 폰트를 서버와 동일하게 고정 (Noto Sans CJK KR)
템플릿이 맑은 고딕·굴림과 테마폰트(Calibri 등)를 참조하고 있었다.
서버에는 이 폰트들이 없어 렌더 시 fontconfig 가 대체하는데, 맥에서는
다른 폰트로 대체돼 화면과 실제 출력이 달랐다(손글씨체로 대체되던 문제).

- word/document.xml 11곳, word/styles.xml 40곳의 rFonts 를 Noto Sans CJK KR 로
- word/theme/theme1.xml 의 major/minor 대표 폰트 4곳도 동일하게
  (대부분의 run 이 rFonts 가 아니라 *Theme 속성으로 테마폰트를 참조하고 있었다)

이제 LibreOffice 로 템플릿을 열면 보이는 화면 = 실제 PDF 출력이다.
서버는 이전에도 같은 폰트로 대체해 렌더했으므로 출력 결과는 사실상 동일하다.
</commit_message>
<xml_diff>
--- a/doc-templates/contract-template.docx
+++ b/doc-templates/contract-template.docx
@@ -3321,7 +3321,7 @@
       </w:pPr>
       <w:r>
         <w:rPr>
-          <w:rFonts w:asciiTheme="majorEastAsia" w:eastAsiaTheme="majorEastAsia" w:hAnsiTheme="majorEastAsia" w:cs="맑은 고딕" w:hint="eastAsia"/>
+          <w:rFonts w:asciiTheme="majorEastAsia" w:eastAsiaTheme="majorEastAsia" w:hAnsiTheme="majorEastAsia" w:cs="Noto Sans CJK KR" w:hint="eastAsia"/>
           <w:color w:val="000000" w:themeColor="text1"/>
           <w:kern w:val="24"/>
           <w:sz w:val="22"/>
@@ -3449,7 +3449,7 @@
       </w:pPr>
       <w:r>
         <w:rPr>
-          <w:rFonts w:asciiTheme="majorEastAsia" w:eastAsiaTheme="majorEastAsia" w:hAnsiTheme="majorEastAsia" w:cs="맑은 고딕" w:hint="eastAsia"/>
+          <w:rFonts w:asciiTheme="majorEastAsia" w:eastAsiaTheme="majorEastAsia" w:hAnsiTheme="majorEastAsia" w:cs="Noto Sans CJK KR" w:hint="eastAsia"/>
           <w:color w:val="000000" w:themeColor="text1"/>
           <w:kern w:val="24"/>
           <w:sz w:val="22"/>
@@ -6538,7 +6538,7 @@
         <w:pStyle w:val="3"/>
         <w:ind w:left="1000" w:hanging="400"/>
         <w:rPr>
-          <w:rFonts w:asciiTheme="majorEastAsia" w:eastAsiaTheme="majorEastAsia" w:hAnsiTheme="majorEastAsia" w:cs="Gulim"/>
+          <w:rFonts w:asciiTheme="majorEastAsia" w:eastAsiaTheme="majorEastAsia" w:hAnsiTheme="majorEastAsia" w:cs="Noto Sans CJK KR"/>
         </w:rPr>
       </w:pPr>
       <w:r>
@@ -7940,14 +7940,14 @@
         <w:autoSpaceDN/>
         <w:contextualSpacing/>
         <w:rPr>
-          <w:rFonts w:asciiTheme="majorEastAsia" w:eastAsiaTheme="majorEastAsia" w:hAnsiTheme="majorEastAsia" w:cs="Gulim"/>
+          <w:rFonts w:asciiTheme="majorEastAsia" w:eastAsiaTheme="majorEastAsia" w:hAnsiTheme="majorEastAsia" w:cs="Noto Sans CJK KR"/>
           <w:sz w:val="24"/>
           <w:szCs w:val="28"/>
         </w:rPr>
       </w:pPr>
       <w:r>
         <w:rPr>
-          <w:rFonts w:asciiTheme="majorEastAsia" w:eastAsiaTheme="majorEastAsia" w:hAnsiTheme="majorEastAsia" w:cs="Gulim" w:hint="eastAsia"/>
+          <w:rFonts w:asciiTheme="majorEastAsia" w:eastAsiaTheme="majorEastAsia" w:hAnsiTheme="majorEastAsia" w:cs="Noto Sans CJK KR" w:hint="eastAsia"/>
           <w:sz w:val="24"/>
           <w:szCs w:val="28"/>
         </w:rPr>
@@ -7955,7 +7955,7 @@
       </w:r>
       <w:r>
         <w:rPr>
-          <w:rFonts w:asciiTheme="majorEastAsia" w:eastAsiaTheme="majorEastAsia" w:hAnsiTheme="majorEastAsia" w:cs="Gulim"/>
+          <w:rFonts w:asciiTheme="majorEastAsia" w:eastAsiaTheme="majorEastAsia" w:hAnsiTheme="majorEastAsia" w:cs="Noto Sans CJK KR"/>
           <w:sz w:val="24"/>
           <w:szCs w:val="28"/>
         </w:rPr>
@@ -7963,7 +7963,7 @@
       </w:r>
       <w:r>
         <w:rPr>
-          <w:rFonts w:asciiTheme="majorEastAsia" w:eastAsiaTheme="majorEastAsia" w:hAnsiTheme="majorEastAsia" w:cs="Gulim" w:hint="eastAsia"/>
+          <w:rFonts w:asciiTheme="majorEastAsia" w:eastAsiaTheme="majorEastAsia" w:hAnsiTheme="majorEastAsia" w:cs="Noto Sans CJK KR" w:hint="eastAsia"/>
           <w:sz w:val="24"/>
           <w:szCs w:val="28"/>
         </w:rPr>
@@ -7971,7 +7971,7 @@
       </w:r>
       <w:r>
         <w:rPr>
-          <w:rFonts w:asciiTheme="majorEastAsia" w:eastAsiaTheme="majorEastAsia" w:hAnsiTheme="majorEastAsia" w:cs="Gulim"/>
+          <w:rFonts w:asciiTheme="majorEastAsia" w:eastAsiaTheme="majorEastAsia" w:hAnsiTheme="majorEastAsia" w:cs="Noto Sans CJK KR"/>
           <w:sz w:val="24"/>
           <w:szCs w:val="28"/>
         </w:rPr>
@@ -7979,7 +7979,7 @@
       </w:r>
       <w:r>
         <w:rPr>
-          <w:rFonts w:asciiTheme="majorEastAsia" w:eastAsiaTheme="majorEastAsia" w:hAnsiTheme="majorEastAsia" w:cs="Gulim" w:hint="eastAsia"/>
+          <w:rFonts w:asciiTheme="majorEastAsia" w:eastAsiaTheme="majorEastAsia" w:hAnsiTheme="majorEastAsia" w:cs="Noto Sans CJK KR" w:hint="eastAsia"/>
           <w:sz w:val="24"/>
           <w:szCs w:val="28"/>
         </w:rPr>
@@ -7987,7 +7987,7 @@
       </w:r>
       <w:r>
         <w:rPr>
-          <w:rFonts w:asciiTheme="majorEastAsia" w:eastAsiaTheme="majorEastAsia" w:hAnsiTheme="majorEastAsia" w:cs="Gulim"/>
+          <w:rFonts w:asciiTheme="majorEastAsia" w:eastAsiaTheme="majorEastAsia" w:hAnsiTheme="majorEastAsia" w:cs="Noto Sans CJK KR"/>
           <w:sz w:val="24"/>
           <w:szCs w:val="28"/>
         </w:rPr>
@@ -7995,7 +7995,7 @@
       </w:r>
       <w:r>
         <w:rPr>
-          <w:rFonts w:asciiTheme="majorEastAsia" w:eastAsiaTheme="majorEastAsia" w:hAnsiTheme="majorEastAsia" w:cs="Gulim" w:hint="eastAsia"/>
+          <w:rFonts w:asciiTheme="majorEastAsia" w:eastAsiaTheme="majorEastAsia" w:hAnsiTheme="majorEastAsia" w:cs="Noto Sans CJK KR" w:hint="eastAsia"/>
           <w:sz w:val="24"/>
           <w:szCs w:val="28"/>
         </w:rPr>
@@ -9634,7 +9634,7 @@
       <w:jc w:val="left"/>
     </w:pPr>
     <w:rPr>
-      <w:rFonts w:ascii="맑은 고딕" w:eastAsia="맑은 고딕" w:hAnsi="맑은 고딕" w:cs="맑은 고딕"/>
+      <w:rFonts w:ascii="Noto Sans CJK KR" w:eastAsia="Noto Sans CJK KR" w:hAnsi="Noto Sans CJK KR" w:cs="Noto Sans CJK KR"/>
       <w:kern w:val="0"/>
       <w:sz w:val="22"/>
       <w:szCs w:val="22"/>
@@ -9752,7 +9752,7 @@
     <w:uiPriority w:val="9"/>
     <w:rsid w:val="00DF34AB"/>
     <w:rPr>
-      <w:rFonts w:ascii="맑은 고딕" w:eastAsia="맑은 고딕" w:hAnsi="맑은 고딕" w:cs="맑은 고딕"/>
+      <w:rFonts w:ascii="Noto Sans CJK KR" w:eastAsia="Noto Sans CJK KR" w:hAnsi="Noto Sans CJK KR" w:cs="Noto Sans CJK KR"/>
       <w:b/>
       <w:bCs/>
       <w:kern w:val="0"/>
@@ -9767,7 +9767,7 @@
     <w:uiPriority w:val="9"/>
     <w:rsid w:val="00DF34AB"/>
     <w:rPr>
-      <w:rFonts w:ascii="맑은 고딕" w:eastAsia="맑은 고딕" w:hAnsi="맑은 고딕" w:cs="맑은 고딕"/>
+      <w:rFonts w:ascii="Noto Sans CJK KR" w:eastAsia="Noto Sans CJK KR" w:hAnsi="Noto Sans CJK KR" w:cs="Noto Sans CJK KR"/>
       <w:b/>
       <w:bCs/>
       <w:kern w:val="0"/>
@@ -9782,7 +9782,7 @@
     <w:uiPriority w:val="9"/>
     <w:rsid w:val="00DF34AB"/>
     <w:rPr>
-      <w:rFonts w:ascii="맑은 고딕" w:eastAsia="맑은 고딕" w:hAnsi="맑은 고딕" w:cs="맑은 고딕"/>
+      <w:rFonts w:ascii="Noto Sans CJK KR" w:eastAsia="Noto Sans CJK KR" w:hAnsi="Noto Sans CJK KR" w:cs="Noto Sans CJK KR"/>
       <w:b/>
       <w:bCs/>
       <w:kern w:val="0"/>
@@ -9797,7 +9797,7 @@
     <w:uiPriority w:val="9"/>
     <w:rsid w:val="00DF34AB"/>
     <w:rPr>
-      <w:rFonts w:ascii="맑은 고딕" w:eastAsia="맑은 고딕" w:hAnsi="맑은 고딕" w:cs="맑은 고딕"/>
+      <w:rFonts w:ascii="Noto Sans CJK KR" w:eastAsia="Noto Sans CJK KR" w:hAnsi="Noto Sans CJK KR" w:cs="Noto Sans CJK KR"/>
       <w:b/>
       <w:bCs/>
       <w:kern w:val="0"/>
@@ -9848,7 +9848,7 @@
     <w:uiPriority w:val="1"/>
     <w:rsid w:val="00DF34AB"/>
     <w:rPr>
-      <w:rFonts w:ascii="맑은 고딕" w:eastAsia="맑은 고딕" w:hAnsi="맑은 고딕" w:cs="맑은 고딕"/>
+      <w:rFonts w:ascii="Noto Sans CJK KR" w:eastAsia="Noto Sans CJK KR" w:hAnsi="Noto Sans CJK KR" w:cs="Noto Sans CJK KR"/>
       <w:kern w:val="0"/>
       <w:sz w:val="22"/>
       <w:szCs w:val="22"/>
@@ -9885,7 +9885,7 @@
       <w:spacing w:before="100" w:beforeAutospacing="1" w:after="100" w:afterAutospacing="1"/>
     </w:pPr>
     <w:rPr>
-      <w:rFonts w:ascii="Gulim" w:eastAsia="Gulim" w:hAnsi="Gulim" w:cs="Gulim"/>
+      <w:rFonts w:ascii="Noto Sans CJK KR" w:eastAsia="Noto Sans CJK KR" w:hAnsi="Noto Sans CJK KR" w:cs="Noto Sans CJK KR"/>
       <w:sz w:val="24"/>
       <w:szCs w:val="24"/>
     </w:rPr>
@@ -9901,7 +9901,7 @@
       <w:spacing w:before="100" w:beforeAutospacing="1" w:after="100" w:afterAutospacing="1"/>
     </w:pPr>
     <w:rPr>
-      <w:rFonts w:ascii="Gulim" w:eastAsia="Gulim" w:hAnsi="Gulim" w:cs="Gulim"/>
+      <w:rFonts w:ascii="Noto Sans CJK KR" w:eastAsia="Noto Sans CJK KR" w:hAnsi="Noto Sans CJK KR" w:cs="Noto Sans CJK KR"/>
       <w:sz w:val="24"/>
       <w:szCs w:val="24"/>
     </w:rPr>
@@ -9946,7 +9946,7 @@
     <w:semiHidden/>
     <w:rsid w:val="00200264"/>
     <w:rPr>
-      <w:rFonts w:ascii="맑은 고딕" w:eastAsia="맑은 고딕" w:hAnsi="맑은 고딕" w:cs="맑은 고딕"/>
+      <w:rFonts w:ascii="Noto Sans CJK KR" w:eastAsia="Noto Sans CJK KR" w:hAnsi="Noto Sans CJK KR" w:cs="Noto Sans CJK KR"/>
       <w:kern w:val="0"/>
       <w:sz w:val="22"/>
       <w:szCs w:val="22"/>
@@ -9974,7 +9974,7 @@
     <w:semiHidden/>
     <w:rsid w:val="00200264"/>
     <w:rPr>
-      <w:rFonts w:ascii="맑은 고딕" w:eastAsia="맑은 고딕" w:hAnsi="맑은 고딕" w:cs="맑은 고딕"/>
+      <w:rFonts w:ascii="Noto Sans CJK KR" w:eastAsia="Noto Sans CJK KR" w:hAnsi="Noto Sans CJK KR" w:cs="Noto Sans CJK KR"/>
       <w:b/>
       <w:bCs/>
       <w:kern w:val="0"/>
@@ -10028,11 +10028,11 @@
     </a:clrScheme>
     <a:fontScheme name="Office">
       <a:majorFont>
-        <a:latin typeface="맑은 고딕" panose="020F0302020204030204"/>
+        <a:latin typeface="Noto Sans CJK KR" panose="020F0302020204030204"/>
         <a:ea typeface=""/>
         <a:cs typeface=""/>
         <a:font script="Jpan" typeface="游ゴシック Light"/>
-        <a:font script="Hang" typeface="맑은 고딕"/>
+        <a:font script="Hang" typeface="Noto Sans CJK KR"/>
         <a:font script="Hans" typeface="等线 Light"/>
         <a:font script="Hant" typeface="新細明體"/>
         <a:font script="Arab" typeface="Times New Roman"/>
@@ -10080,11 +10080,11 @@
         <a:font script="Tfng" typeface="Ebrima"/>
       </a:majorFont>
       <a:minorFont>
-        <a:latin typeface="맑은 고딕" panose="020F0502020204030204"/>
+        <a:latin typeface="Noto Sans CJK KR" panose="020F0502020204030204"/>
         <a:ea typeface=""/>
         <a:cs typeface=""/>
         <a:font script="Jpan" typeface="游明朝"/>
-        <a:font script="Hang" typeface="맑은 고딕"/>
+        <a:font script="Hang" typeface="Noto Sans CJK KR"/>
         <a:font script="Hans" typeface="等线"/>
         <a:font script="Hant" typeface="新細明體"/>
         <a:font script="Arab" typeface="Arial"/>

</xml_diff>